<commit_message>
excluded .docx files from publishing
</commit_message>
<xml_diff>
--- a/MohamedAtef-Lifestyle-ResearchResult.docx
+++ b/MohamedAtef-Lifestyle-ResearchResult.docx
@@ -13,7 +13,10 @@
           <w:szCs w:val="32"/>
         </w:rPr>
       </w:pPr>
-      <w:r>
+    </w:p>
+    <w:p>
+      <w:pPr>
+        <w:jc w:val="center"/>
         <w:rPr>
           <w:rFonts w:asciiTheme="majorBidi" w:hAnsiTheme="majorBidi" w:cstheme="majorBidi"/>
           <w:b/>
@@ -21,6 +24,335 @@
           <w:sz w:val="32"/>
           <w:szCs w:val="32"/>
         </w:rPr>
+      </w:pPr>
+    </w:p>
+    <w:p>
+      <w:pPr>
+        <w:jc w:val="center"/>
+        <w:rPr>
+          <w:rFonts w:asciiTheme="majorBidi" w:hAnsiTheme="majorBidi" w:cstheme="majorBidi"/>
+          <w:b/>
+          <w:bCs/>
+          <w:sz w:val="32"/>
+          <w:szCs w:val="32"/>
+        </w:rPr>
+      </w:pPr>
+    </w:p>
+    <w:p>
+      <w:pPr>
+        <w:jc w:val="center"/>
+        <w:rPr>
+          <w:rFonts w:asciiTheme="majorBidi" w:hAnsiTheme="majorBidi" w:cstheme="majorBidi"/>
+          <w:b/>
+          <w:bCs/>
+          <w:sz w:val="32"/>
+          <w:szCs w:val="32"/>
+        </w:rPr>
+      </w:pPr>
+    </w:p>
+    <w:p>
+      <w:pPr>
+        <w:jc w:val="center"/>
+        <w:rPr>
+          <w:rFonts w:asciiTheme="majorBidi" w:hAnsiTheme="majorBidi" w:cstheme="majorBidi"/>
+          <w:b/>
+          <w:bCs/>
+          <w:sz w:val="32"/>
+          <w:szCs w:val="32"/>
+        </w:rPr>
+      </w:pPr>
+    </w:p>
+    <w:p>
+      <w:pPr>
+        <w:jc w:val="center"/>
+        <w:rPr>
+          <w:rFonts w:asciiTheme="majorBidi" w:hAnsiTheme="majorBidi" w:cstheme="majorBidi"/>
+          <w:b/>
+          <w:bCs/>
+          <w:sz w:val="32"/>
+          <w:szCs w:val="32"/>
+        </w:rPr>
+      </w:pPr>
+    </w:p>
+    <w:p>
+      <w:pPr>
+        <w:jc w:val="center"/>
+        <w:rPr>
+          <w:rFonts w:asciiTheme="majorBidi" w:hAnsiTheme="majorBidi" w:cstheme="majorBidi"/>
+          <w:b/>
+          <w:bCs/>
+          <w:sz w:val="32"/>
+          <w:szCs w:val="32"/>
+        </w:rPr>
+      </w:pPr>
+    </w:p>
+    <w:p>
+      <w:pPr>
+        <w:jc w:val="center"/>
+        <w:rPr>
+          <w:rFonts w:asciiTheme="majorBidi" w:hAnsiTheme="majorBidi" w:cstheme="majorBidi"/>
+          <w:b/>
+          <w:bCs/>
+          <w:sz w:val="32"/>
+          <w:szCs w:val="32"/>
+        </w:rPr>
+      </w:pPr>
+    </w:p>
+    <w:p>
+      <w:pPr>
+        <w:jc w:val="center"/>
+        <w:rPr>
+          <w:rFonts w:asciiTheme="majorBidi" w:hAnsiTheme="majorBidi" w:cstheme="majorBidi"/>
+          <w:b/>
+          <w:bCs/>
+          <w:sz w:val="32"/>
+          <w:szCs w:val="32"/>
+        </w:rPr>
+      </w:pPr>
+      <w:r>
+        <w:rPr>
+          <w:rFonts w:asciiTheme="majorBidi" w:hAnsiTheme="majorBidi" w:cstheme="majorBidi"/>
+          <w:b/>
+          <w:bCs/>
+          <w:sz w:val="32"/>
+          <w:szCs w:val="32"/>
+        </w:rPr>
+        <w:t xml:space="preserve">Mohamed </w:t>
+      </w:r>
+      <w:proofErr w:type="spellStart"/>
+      <w:r>
+        <w:rPr>
+          <w:rFonts w:asciiTheme="majorBidi" w:hAnsiTheme="majorBidi" w:cstheme="majorBidi"/>
+          <w:b/>
+          <w:bCs/>
+          <w:sz w:val="32"/>
+          <w:szCs w:val="32"/>
+        </w:rPr>
+        <w:t>Atef</w:t>
+      </w:r>
+      <w:proofErr w:type="spellEnd"/>
+      <w:r>
+        <w:rPr>
+          <w:rFonts w:asciiTheme="majorBidi" w:hAnsiTheme="majorBidi" w:cstheme="majorBidi"/>
+          <w:b/>
+          <w:bCs/>
+          <w:sz w:val="32"/>
+          <w:szCs w:val="32"/>
+        </w:rPr>
+        <w:t xml:space="preserve"> </w:t>
+      </w:r>
+      <w:proofErr w:type="spellStart"/>
+      <w:r>
+        <w:rPr>
+          <w:rFonts w:asciiTheme="majorBidi" w:hAnsiTheme="majorBidi" w:cstheme="majorBidi"/>
+          <w:b/>
+          <w:bCs/>
+          <w:sz w:val="32"/>
+          <w:szCs w:val="32"/>
+        </w:rPr>
+        <w:t>Abdallah</w:t>
+      </w:r>
+      <w:proofErr w:type="spellEnd"/>
+      <w:r>
+        <w:rPr>
+          <w:rFonts w:asciiTheme="majorBidi" w:hAnsiTheme="majorBidi" w:cstheme="majorBidi"/>
+          <w:b/>
+          <w:bCs/>
+          <w:sz w:val="32"/>
+          <w:szCs w:val="32"/>
+        </w:rPr>
+        <w:t xml:space="preserve"> </w:t>
+      </w:r>
+      <w:proofErr w:type="spellStart"/>
+      <w:r>
+        <w:rPr>
+          <w:rFonts w:asciiTheme="majorBidi" w:hAnsiTheme="majorBidi" w:cstheme="majorBidi"/>
+          <w:b/>
+          <w:bCs/>
+          <w:sz w:val="32"/>
+          <w:szCs w:val="32"/>
+        </w:rPr>
+        <w:t>Hamed</w:t>
+      </w:r>
+      <w:proofErr w:type="spellEnd"/>
+    </w:p>
+    <w:p>
+      <w:pPr>
+        <w:jc w:val="center"/>
+        <w:rPr>
+          <w:rFonts w:asciiTheme="majorBidi" w:hAnsiTheme="majorBidi" w:cstheme="majorBidi"/>
+          <w:b/>
+          <w:bCs/>
+          <w:sz w:val="32"/>
+          <w:szCs w:val="32"/>
+        </w:rPr>
+      </w:pPr>
+      <w:r>
+        <w:rPr>
+          <w:rFonts w:asciiTheme="majorBidi" w:hAnsiTheme="majorBidi" w:cstheme="majorBidi"/>
+          <w:b/>
+          <w:bCs/>
+          <w:sz w:val="32"/>
+          <w:szCs w:val="32"/>
+        </w:rPr>
+        <w:t>PhD Degree</w:t>
+      </w:r>
+    </w:p>
+    <w:p>
+      <w:pPr>
+        <w:jc w:val="center"/>
+        <w:rPr>
+          <w:rFonts w:asciiTheme="majorBidi" w:hAnsiTheme="majorBidi" w:cstheme="majorBidi"/>
+          <w:b/>
+          <w:bCs/>
+          <w:sz w:val="32"/>
+          <w:szCs w:val="32"/>
+        </w:rPr>
+      </w:pPr>
+      <w:r>
+        <w:rPr>
+          <w:rFonts w:asciiTheme="majorBidi" w:hAnsiTheme="majorBidi" w:cstheme="majorBidi"/>
+          <w:b/>
+          <w:bCs/>
+          <w:sz w:val="32"/>
+          <w:szCs w:val="32"/>
+        </w:rPr>
+        <w:t>Selected Topics Course</w:t>
+      </w:r>
+    </w:p>
+    <w:p>
+      <w:pPr>
+        <w:jc w:val="center"/>
+        <w:rPr>
+          <w:rFonts w:asciiTheme="majorBidi" w:hAnsiTheme="majorBidi" w:cstheme="majorBidi"/>
+          <w:b/>
+          <w:bCs/>
+          <w:sz w:val="32"/>
+          <w:szCs w:val="32"/>
+        </w:rPr>
+      </w:pPr>
+      <w:proofErr w:type="spellStart"/>
+      <w:r>
+        <w:rPr>
+          <w:rFonts w:asciiTheme="majorBidi" w:hAnsiTheme="majorBidi" w:cstheme="majorBidi"/>
+          <w:b/>
+          <w:bCs/>
+          <w:sz w:val="32"/>
+          <w:szCs w:val="32"/>
+        </w:rPr>
+        <w:t>Fayoum</w:t>
+      </w:r>
+      <w:proofErr w:type="spellEnd"/>
+      <w:r>
+        <w:rPr>
+          <w:rFonts w:asciiTheme="majorBidi" w:hAnsiTheme="majorBidi" w:cstheme="majorBidi"/>
+          <w:b/>
+          <w:bCs/>
+          <w:sz w:val="32"/>
+          <w:szCs w:val="32"/>
+        </w:rPr>
+        <w:t xml:space="preserve"> University</w:t>
+      </w:r>
+    </w:p>
+    <w:p>
+      <w:pPr>
+        <w:jc w:val="center"/>
+        <w:rPr>
+          <w:rFonts w:asciiTheme="majorBidi" w:hAnsiTheme="majorBidi" w:cstheme="majorBidi"/>
+          <w:b/>
+          <w:bCs/>
+          <w:sz w:val="32"/>
+          <w:szCs w:val="32"/>
+        </w:rPr>
+      </w:pPr>
+      <w:r>
+        <w:rPr>
+          <w:rFonts w:asciiTheme="majorBidi" w:hAnsiTheme="majorBidi" w:cstheme="majorBidi"/>
+          <w:b/>
+          <w:bCs/>
+          <w:sz w:val="32"/>
+          <w:szCs w:val="32"/>
+        </w:rPr>
+        <w:t>2026</w:t>
+      </w:r>
+    </w:p>
+    <w:p>
+      <w:pPr>
+        <w:jc w:val="center"/>
+        <w:rPr>
+          <w:rFonts w:asciiTheme="majorBidi" w:hAnsiTheme="majorBidi" w:cstheme="majorBidi"/>
+          <w:b/>
+          <w:bCs/>
+          <w:sz w:val="32"/>
+          <w:szCs w:val="32"/>
+        </w:rPr>
+      </w:pPr>
+    </w:p>
+    <w:p>
+      <w:pPr>
+        <w:jc w:val="center"/>
+        <w:rPr>
+          <w:rFonts w:asciiTheme="majorBidi" w:hAnsiTheme="majorBidi" w:cstheme="majorBidi"/>
+          <w:b/>
+          <w:bCs/>
+          <w:sz w:val="32"/>
+          <w:szCs w:val="32"/>
+        </w:rPr>
+      </w:pPr>
+    </w:p>
+    <w:p>
+      <w:pPr>
+        <w:jc w:val="center"/>
+        <w:rPr>
+          <w:rFonts w:asciiTheme="majorBidi" w:hAnsiTheme="majorBidi" w:cstheme="majorBidi"/>
+          <w:b/>
+          <w:bCs/>
+          <w:sz w:val="32"/>
+          <w:szCs w:val="32"/>
+        </w:rPr>
+      </w:pPr>
+    </w:p>
+    <w:p>
+      <w:pPr>
+        <w:rPr>
+          <w:rFonts w:asciiTheme="majorBidi" w:hAnsiTheme="majorBidi" w:cstheme="majorBidi"/>
+          <w:b/>
+          <w:bCs/>
+          <w:sz w:val="32"/>
+          <w:szCs w:val="32"/>
+        </w:rPr>
+      </w:pPr>
+      <w:r>
+        <w:rPr>
+          <w:rFonts w:asciiTheme="majorBidi" w:hAnsiTheme="majorBidi" w:cstheme="majorBidi"/>
+          <w:b/>
+          <w:bCs/>
+          <w:sz w:val="32"/>
+          <w:szCs w:val="32"/>
+        </w:rPr>
+        <w:br w:type="page"/>
+      </w:r>
+    </w:p>
+    <w:p>
+      <w:pPr>
+        <w:jc w:val="center"/>
+        <w:rPr>
+          <w:rFonts w:asciiTheme="majorBidi" w:hAnsiTheme="majorBidi" w:cstheme="majorBidi"/>
+          <w:b/>
+          <w:bCs/>
+          <w:sz w:val="32"/>
+          <w:szCs w:val="32"/>
+        </w:rPr>
+      </w:pPr>
+      <w:r>
+        <w:rPr>
+          <w:rFonts w:asciiTheme="majorBidi" w:hAnsiTheme="majorBidi" w:cstheme="majorBidi"/>
+          <w:b/>
+          <w:bCs/>
+          <w:sz w:val="32"/>
+          <w:szCs w:val="32"/>
+        </w:rPr>
+        <w:lastRenderedPageBreak/>
         <w:t>AI-Driven Time-Series Lifestyle Prediction and Recommendation System Using LSTM</w:t>
       </w:r>
     </w:p>
@@ -187,7 +519,12 @@
       </w:r>
       <w:proofErr w:type="spellEnd"/>
       <w:r>
-        <w:t xml:space="preserve"> et al. (2024) introduced a CNN-LSTM hybrid model for activity recognition, improving accuracy through spatial-temporal feature extraction . </w:t>
+        <w:t xml:space="preserve"> et al. (2024) introduced a CNN-LSTM hybr</w:t>
+      </w:r>
+      <w:bookmarkStart w:id="0" w:name="_GoBack"/>
+      <w:bookmarkEnd w:id="0"/>
+      <w:r>
+        <w:t xml:space="preserve">id model for activity recognition, improving accuracy through spatial-temporal feature extraction . </w:t>
       </w:r>
     </w:p>
     <w:p>
@@ -591,8 +928,6 @@
           <w:rStyle w:val="vlist-s"/>
         </w:rPr>
       </w:pPr>
-      <w:bookmarkStart w:id="0" w:name="_GoBack"/>
-      <w:bookmarkEnd w:id="0"/>
       <w:proofErr w:type="spellStart"/>
       <w:r>
         <w:rPr>
@@ -1868,6 +2203,9 @@
         <w:jc w:val="center"/>
       </w:pPr>
       <w:r>
+        <w:rPr>
+          <w:noProof/>
+        </w:rPr>
         <w:drawing>
           <wp:inline distT="0" distB="0" distL="0" distR="0" wp14:anchorId="66A3B61B" wp14:editId="35D787CC">
             <wp:extent cx="2362530" cy="1076475"/>
@@ -2322,17 +2660,7 @@
           <w:sz w:val="36"/>
           <w:szCs w:val="36"/>
         </w:rPr>
-        <w:t>5.4 Discussion</w:t>
-      </w:r>
-      <w:r>
-        <w:rPr>
-          <w:rFonts w:ascii="Times New Roman" w:eastAsia="Times New Roman" w:hAnsi="Times New Roman" w:cs="Times New Roman"/>
-          <w:b/>
-          <w:bCs/>
-          <w:sz w:val="36"/>
-          <w:szCs w:val="36"/>
-        </w:rPr>
-        <w:t>:</w:t>
+        <w:t>5.4 Discussion:</w:t>
       </w:r>
     </w:p>
     <w:p>

</xml_diff>